<commit_message>
fix wrong couple product for etacom and busway report
</commit_message>
<xml_diff>
--- a/templates/COA_Busway_template.docx
+++ b/templates/COA_Busway_template.docx
@@ -527,7 +527,14 @@
                 <w:rFonts w:ascii="Calibri" w:hAnsi="Calibri" w:cs="Calibri"/>
                 <w:szCs w:val="24"/>
               </w:rPr>
-              <w:t>Couple: HY2533</w:t>
+              <w:t xml:space="preserve">Couple: </w:t>
+            </w:r>
+            <w:r>
+              <w:rPr>
+                <w:rFonts w:ascii="Calibri" w:hAnsi="Calibri" w:cs="Calibri"/>
+                <w:szCs w:val="24"/>
+              </w:rPr>
+              <w:t>{{ couple }}</w:t>
             </w:r>
           </w:p>
         </w:tc>
@@ -888,7 +895,7 @@
       <w:jc w:val="center"/>
     </w:pPr>
     <w:r>
-      <w:pict w14:anchorId="21B3BFD3">
+      <w:pict w14:anchorId="195032AE">
         <v:shapetype id="_x0000_t75" coordsize="21600,21600" o:spt="75" o:preferrelative="t" path="m@4@5l@4@11@9@11@9@5xe" filled="f" stroked="f">
           <v:stroke joinstyle="miter"/>
           <v:formulas>
@@ -908,8 +915,9 @@
           <v:path o:extrusionok="f" gradientshapeok="t" o:connecttype="rect"/>
           <o:lock v:ext="edit" aspectratio="t"/>
         </v:shapetype>
-        <v:shape id="_x0000_i1025" type="#_x0000_t75" alt="" style="width:138.05pt;height:27.1pt;mso-width-percent:0;mso-height-percent:0;mso-width-percent:0;mso-height-percent:0">
-          <v:imagedata r:id="rId1" o:title="瑞肯logo"/>
+        <v:shape id="圖片 1" o:spid="_x0000_i1025" type="#_x0000_t75" style="width:137.9pt;height:27.05pt;visibility:visible;mso-wrap-style:square">
+          <v:imagedata r:id="rId1" o:title=""/>
+          <o:lock v:ext="edit" rotation="t" cropping="t" verticies="t"/>
         </v:shape>
       </w:pict>
     </w:r>
@@ -962,7 +970,7 @@
         <w:sz w:val="48"/>
         <w:szCs w:val="48"/>
       </w:rPr>
-      <w:pict w14:anchorId="4E711818">
+      <w:pict w14:anchorId="56F43B6B">
         <v:shapetype id="_x0000_t32" coordsize="21600,21600" o:spt="32" o:oned="t" path="m,l21600,21600e" filled="f">
           <v:path arrowok="t" fillok="f" o:connecttype="none"/>
           <o:lock v:ext="edit" shapetype="t"/>
@@ -1013,7 +1021,7 @@
         <w:sz w:val="48"/>
         <w:szCs w:val="48"/>
       </w:rPr>
-      <w:pict w14:anchorId="49B682B8">
+      <w:pict w14:anchorId="1ED5D1EB">
         <v:shapetype id="_x0000_t202" coordsize="21600,21600" o:spt="202" path="m,l,21600r21600,l21600,xe">
           <v:stroke joinstyle="miter"/>
           <v:path gradientshapeok="t" o:connecttype="rect"/>

</xml_diff>